<commit_message>
Discover permitted Claude gateway models automatically
Configure exact published Claude aliases and family shortcuts across Windows and macOS clients. Update onboarding guides and add offline discovery regression coverage.

Co-authored-by: Copilot <223556219+Copilot@users.noreply.github.com>

Copilot-Session: 2f627362-bfb7-4b9d-b3b1-0be3932e3265
</commit_message>
<xml_diff>
--- a/docs/AI-Gateway-Customer-Onboarding-Guide.docx
+++ b/docs/AI-Gateway-Customer-Onboarding-Guide.docx
@@ -190,11 +190,11 @@
         <w:ind w:left="288" w:hanging="288"/>
       </w:pPr>
       <w:r>
-        <w:t>2.</w:t>
+        <w:t>2.Create or identify the approved Microsoft Entra user group and grant it AI Gateway Models User access at the appropriate gateway or model scope. Also grant Reader on the gateway (or equivalent scoped catalog and effective-permission read access) so the script can discover models. Reader alone does not grant model invocation.</w:t>
       </w:r>
       <w:r>
         <w:tab/>
-        <w:t>Create or identify the approved Microsoft Entra user group and grant it AI Gateway Models User access at the appropriate gateway or model scope.</w:t>
+        <w:t/>
       </w:r>
     </w:p>
     <w:p>
@@ -379,7 +379,7 @@
     </w:p>
     <w:p>
       <w:r>
-        <w:t>Your Azure/IT administrator collects these three connection details. Business users do not need Azure portal access to find them:</w:t>
+        <w:t>Your Azure/IT administrator collects these two connection details. Business users do not need Azure portal access to find them:</w:t>
       </w:r>
     </w:p>
     <w:tbl>
@@ -545,7 +545,7 @@
               <w:rPr>
                 <w:sz w:val="19"/>
               </w:rPr>
-              <w:t>[customer gateway Anthropic base URL]</w:t>
+              <w:t>[customer gateway runtime URL]</w:t>
             </w:r>
           </w:p>
         </w:tc>
@@ -561,64 +561,7 @@
               <w:rPr>
                 <w:sz w:val="19"/>
               </w:rPr>
-              <w:t>AI Gateway portal &gt; select the gateway &gt; Models &gt; approved Claude model. Copy the Anthropic gateway endpoint from its connection details or request example.</w:t>
-            </w:r>
-          </w:p>
-        </w:tc>
-      </w:tr>
-      <w:tr>
-        <w:trPr>
-          <w:cnfStyle w:val="000000100000" w:firstRow="0" w:lastRow="0" w:firstColumn="0" w:lastColumn="0" w:oddVBand="0" w:evenVBand="0" w:oddHBand="1" w:evenHBand="0" w:firstRowFirstColumn="0" w:firstRowLastColumn="0" w:lastRowFirstColumn="0" w:lastRowLastColumn="0"/>
-          <w:cantSplit/>
-          <w:jc w:val="center"/>
-        </w:trPr>
-        <w:tc>
-          <w:tcPr>
-            <w:cnfStyle w:val="001000000000" w:firstRow="0" w:lastRow="0" w:firstColumn="1" w:lastColumn="0" w:oddVBand="0" w:evenVBand="0" w:oddHBand="0" w:evenHBand="0" w:firstRowFirstColumn="0" w:firstRowLastColumn="0" w:lastRowFirstColumn="0" w:lastRowLastColumn="0"/>
-            <w:tcW w:w="1944" w:type="dxa"/>
-          </w:tcPr>
-          <w:p>
-            <w:pPr>
-              <w:spacing w:before="60" w:after="80"/>
-            </w:pPr>
-            <w:r>
-              <w:rPr>
-                <w:sz w:val="19"/>
-              </w:rPr>
-              <w:t>Approved model aliases</w:t>
-            </w:r>
-          </w:p>
-        </w:tc>
-        <w:tc>
-          <w:tcPr>
-            <w:tcW w:w="3096" w:type="dxa"/>
-          </w:tcPr>
-          <w:p>
-            <w:pPr>
-              <w:spacing w:before="60" w:after="80"/>
-              <w:cnfStyle w:val="000000100000" w:firstRow="0" w:lastRow="0" w:firstColumn="0" w:lastColumn="0" w:oddVBand="0" w:evenVBand="0" w:oddHBand="1" w:evenHBand="0" w:firstRowFirstColumn="0" w:firstRowLastColumn="0" w:lastRowFirstColumn="0" w:lastRowLastColumn="0"/>
-            </w:pPr>
-            <w:r>
-              <w:rPr>
-                <w:sz w:val="19"/>
-              </w:rPr>
-              <w:t>[full model aliases published through the gateway]</w:t>
-            </w:r>
-          </w:p>
-        </w:tc>
-        <w:tc>
-          <w:tcPr>
-            <w:tcW w:w="4709" w:type="dxa"/>
-          </w:tcPr>
-          <w:p>
-            <w:pPr>
-              <w:cnfStyle w:val="000000100000" w:firstRow="0" w:lastRow="0" w:firstColumn="0" w:lastColumn="0" w:oddVBand="0" w:evenVBand="0" w:oddHBand="1" w:evenHBand="0" w:firstRowFirstColumn="0" w:firstRowLastColumn="0" w:lastRowFirstColumn="0" w:lastRowLastColumn="0"/>
-            </w:pPr>
-            <w:r>
-              <w:rPr>
-                <w:sz w:val="19"/>
-              </w:rPr>
-              <w:t>In the same gateway's Models page, copy the exact names used in the request's model field, including any prefix. These are not necessarily the Foundry deployment names.</w:t>
+              <w:t>AI Gateway portal &gt; select the gateway &gt; Home &gt; Gateway runtime endpoint. Copy this URL; the script adds the Anthropic endpoint path automatically.</w:t>
             </w:r>
           </w:p>
         </w:tc>
@@ -631,17 +574,17 @@
     </w:p>
     <w:p>
       <w:r>
-        <w:t>Gateway base URL format: https://&lt;gateway-host&gt;.ai.gateway.azure.com/default/models/anthropic</w:t>
+        <w:t>Gateway runtime URL format: https://&lt;gateway-host&gt;.ai.gateway.azure.com</w:t>
       </w:r>
     </w:p>
     <w:p>
       <w:r>
-        <w:t>If the request example ends in /v1/messages, remove that suffix. Do not use the portal address or the direct Foundry backend endpoint.</w:t>
+        <w:t>The full Anthropic base URL ending in /default/models/anthropic also works. Do not use the portal address, a /v1/messages operation URL, or the direct Foundry backend endpoint.</w:t>
       </w:r>
     </w:p>
     <w:p>
       <w:r>
-        <w:t>A model alias is the name used to select a model through the gateway. Users should enter the exact aliases provided by the platform team, not a model name copied from another example.</w:t>
+        <w:t>The script automatically discovers published Claude aliases that the signed-in user is permitted to invoke. Developers do not enter model names or shortcut mappings. Other model providers and incompatible endpoints are excluded. Rerun onboarding after gateway models or group access change to refresh the local list.</w:t>
       </w:r>
     </w:p>
     <w:p>
@@ -653,7 +596,7 @@
           <wp:inline distT="0" distB="0" distL="0" distR="0" wp14:anchorId="4B8291AE" wp14:editId="2625DF50">
             <wp:extent cx="6190615" cy="1329055"/>
             <wp:effectExtent l="0" t="0" r="635" b="4445"/>
-            <wp:docPr id="1244823267" name="Picture 1" descr="The image contains a series of instructions on how to locate and document important information for setting up an AI Gateway connection, including finding the Tenant ID, Gateway base URL, and approved model names.&#10;&#10;AI-generated content may be incorrect."/>
+            <wp:docPr id="1244823267" name="Picture 1" descr="The image contains a series of instructions on how to locate and document important information for setting up an AI Gateway connection, including finding the Tenant ID, Gateway base URL, and approved model names.  AI-generated content may be incorrect."/>
             <wp:cNvGraphicFramePr>
               <a:graphicFrameLocks xmlns:a="http://schemas.openxmlformats.org/drawingml/2006/main" noChangeAspect="1"/>
             </wp:cNvGraphicFramePr>
@@ -661,7 +604,7 @@
               <a:graphicData uri="http://schemas.openxmlformats.org/drawingml/2006/picture">
                 <pic:pic xmlns:pic="http://schemas.openxmlformats.org/drawingml/2006/picture">
                   <pic:nvPicPr>
-                    <pic:cNvPr id="1244823267" name="Picture 1" descr="The image contains a series of instructions on how to locate and document important information for setting up an AI Gateway connection, including finding the Tenant ID, Gateway base URL, and approved model names.&#10;&#10;AI-generated content may be incorrect."/>
+                    <pic:cNvPr id="1244823267" name="Picture 1" descr="The image contains a series of instructions on how to locate and document important information for setting up an AI Gateway connection, including finding the Tenant ID, Gateway base URL, and approved model names.  AI-generated content may be incorrect."/>
                     <pic:cNvPicPr/>
                   </pic:nvPicPr>
                   <pic:blipFill>
@@ -855,7 +798,7 @@
     </w:p>
     <w:p>
       <w:r>
-        <w:t>For the selected applications, the script checks prerequisites, installs missing supported software and saves the connection settings.</w:t>
+        <w:t>For the selected applications, the script checks prerequisites, signs in, discovers permitted Claude models, installs missing supported software and saves the connection settings. Discovery uses read-only Azure management APIs and does not send inference requests or change permissions. If discovery fails, no default model is guessed.</w:t>
       </w:r>
     </w:p>
     <w:p>
@@ -1155,7 +1098,7 @@
               <w:rPr>
                 <w:sz w:val="19"/>
               </w:rPr>
-              <w:t>Customer-provided model aliases</w:t>
+              <w:t>Automatically discovered permitted Claude aliases</w:t>
             </w:r>
           </w:p>
         </w:tc>

</xml_diff>